<commit_message>
Revise prose to the author's academic writing style
Revise the README, manuscript sections, one-pager, conference abstract
and literature review to follow the style of the author's dissertation
(Cistola 2023): "This study ..." in place of "we", explicit purpose
statements, serial commas, parenthetical "(as opposed to ...)" and
"(for example, ...)" asides, and Future Research / Limitations phrasing.
No numbers or findings changed. Also corrects the CERT README's total
payments denominator ($439.9B, not $9.4B) and updates the manuscript
word counts. Re-rendered PDF, Word and HTML outputs.

Co-Authored-By: Claude Opus 5.5 <noreply@anthropic.com>
Claude-Session: https://claude.ai/code/session_01FT6WTZJtFYxxeWDSEVdy7M
</commit_message>
<xml_diff>
--- a/literature-review/improper-payment-estimation-accuracy-literature-review.docx
+++ b/literature-review/improper-payment-estimation-accuracy-literature-review.docx
@@ -264,7 +264,7 @@
         <w:t xml:space="preserve"> </w:t>
       </w:r>
       <w:r>
-        <w:t xml:space="preserve">The Payment Integrity Information Act of 2019 requires statistically valid improper payment estimates, with confidence intervals, for federal programs at risk of significant improper payments. CMS produces five such estimates: Medicare Part C, Medicare Part D, Medicaid and CHIP (PERM), the Marketplace advance premium tax credit (EIPM) and Medicare fee-for-service (CERT). Each projects audited errors from a probability sample, using design-based analytic estimators (expansion, ratio, regression) or simulation that reruns the payment rules.</w:t>
+        <w:t xml:space="preserve">The Payment Integrity Information Act of 2019 requires statistically valid improper payment estimates, with confidence intervals, for federal programs at risk of significant improper payments. The Centers for Medicare &amp; Medicaid Services (CMS) produces five such estimates: Medicare Part C, Medicare Part D, Medicaid and CHIP (PERM), the Marketplace advance premium tax credit (EIPM), and Medicare fee-for-service (CERT). Each estimate projects audited errors from a probability sample using either design-based analytic estimators (expansion, ratio, or regression) or simulation that reruns the payment rules.</w:t>
       </w:r>
     </w:p>
     <w:p>
@@ -282,7 +282,7 @@
         <w:t xml:space="preserve"> </w:t>
       </w:r>
       <w:r>
-        <w:t xml:space="preserve">To review what is known about the comparative accuracy of the available methods for estimating improper payments in federal health programs. Accuracy has two parts:</w:t>
+        <w:t xml:space="preserve">The purpose of this review is to describe what is known about the comparative accuracy of the available methods for estimating improper payments in federal health programs. In this review, accuracy has two parts:</w:t>
       </w:r>
     </w:p>
     <w:p>
@@ -306,7 +306,7 @@
         <w:pStyle w:val="Compact"/>
       </w:pPr>
       <w:r>
-        <w:t xml:space="preserve">interval accuracy: coverage at the nominal level, then width.</w:t>
+        <w:t xml:space="preserve">interval accuracy (coverage at the nominal level and, after that, width).</w:t>
       </w:r>
     </w:p>
     <w:p>
@@ -324,7 +324,7 @@
         <w:t xml:space="preserve"> </w:t>
       </w:r>
       <w:r>
-        <w:t xml:space="preserve">We conducted a narrative review of two bodies of work:</w:t>
+        <w:t xml:space="preserve">This study is a narrative review of two bodies of work:</w:t>
       </w:r>
     </w:p>
     <w:p>
@@ -336,7 +336,7 @@
         <w:pStyle w:val="Compact"/>
       </w:pPr>
       <w:r>
-        <w:t xml:space="preserve">public statute, OMB guidance and CMS, HHS, GAO and OIG methodology documents for the five programs and for contract-level RADV audits;</w:t>
+        <w:t xml:space="preserve">public statute, OMB guidance, and CMS, HHS, GAO, and OIG methodology documents for the five programs and for contract-level RADV audits;</w:t>
       </w:r>
     </w:p>
     <w:p>
@@ -366,7 +366,7 @@
         <w:t xml:space="preserve"> </w:t>
       </w:r>
       <w:r>
-        <w:t xml:space="preserve">All five programs use stratified probability samples and ratio-type estimators. Part D alone publicly describes a simulation-based interval; the others document or imply normal-theory intervals. Interval accuracy depends mainly on two things, not on the method’s name:</w:t>
+        <w:t xml:space="preserve">All five programs use stratified probability samples and ratio-type estimators. Part D alone publicly describes a simulation-based interval, while the others document or imply normal-theory intervals. Interval accuracy depends mainly on two factors (as opposed to the name of the method):</w:t>
       </w:r>
     </w:p>
     <w:p>
@@ -398,7 +398,7 @@
         <w:pStyle w:val="FirstParagraph"/>
       </w:pPr>
       <w:r>
-        <w:t xml:space="preserve">Normal-theory intervals are conservative at low error rates and liberal at high ones. Second-order bootstrap intervals (BCa, bootstrap-</w:t>
+        <w:t xml:space="preserve">Normal-theory intervals are conservative at low error rates and liberal at high ones. Second-order bootstrap intervals (BCa and bootstrap-</w:t>
       </w:r>
       <w:r>
         <w:rPr>
@@ -408,7 +408,7 @@
         <w:t xml:space="preserve">t</w:t>
       </w:r>
       <w:r>
-        <w:t xml:space="preserve">) repair much of the low-error failure. No published study has compared these methods against a known truth in the designs CMS uses: risk-score, drug-benefit, eligibility, APTC or national claims estimates.</w:t>
+        <w:t xml:space="preserve">) correct much of the low-error failure. No published study has compared these methods against a known truth in the designs CMS uses (risk-score, drug-benefit, eligibility, APTC, or national claims estimates).</w:t>
       </w:r>
     </w:p>
     <w:p>
@@ -426,7 +426,7 @@
         <w:t xml:space="preserve"> </w:t>
       </w:r>
       <w:r>
-        <w:t xml:space="preserve">The comparative accuracy of improper payment estimation methods in federal health programs is largely untested, and the methods in production rest on assumptions the evidence questions. We set out a research agenda: design-based Monte Carlo validation against synthetic populations, scored on the metric that matches each estimate’s use.</w:t>
+        <w:t xml:space="preserve">The comparative accuracy of improper payment estimation methods in federal health programs is largely untested, and the methods in production rest on assumptions that the evidence calls into question. This review sets out a research agenda for design-based Monte Carlo validation against synthetic populations, scored on the metric that matches the use of each estimate.</w:t>
       </w:r>
     </w:p>
     <w:p>
@@ -486,7 +486,7 @@
         <w:pStyle w:val="Compact"/>
       </w:pPr>
       <w:r>
-        <w:t xml:space="preserve">establishes each sampled unit’s payment error by review;</w:t>
+        <w:t xml:space="preserve">establishes the payment error of each sampled unit through review;</w:t>
       </w:r>
     </w:p>
     <w:p>
@@ -506,7 +506,7 @@
         <w:pStyle w:val="FirstParagraph"/>
       </w:pPr>
       <w:r>
-        <w:t xml:space="preserve">The estimates matter. CMS’s five measurements reported more than $90 billion in improper payments for FY 2025. Their confidence intervals are audited by Inspectors General. And in some settings the estimates become financial determinations: Medicare Advantage contract recoveries, and, from FY 2030, Medicaid federal match disallowances above a 3% eligibility error rate.</w:t>
+        <w:t xml:space="preserve">These estimates matter. The five CMS measurements reported more than $90 billion in improper payments for FY 2025, and their confidence intervals are audited by Inspectors General. In addition, in some settings the estimates become financial determinations (for example, Medicare Advantage contract recoveries and, beginning in FY 2030, Medicaid federal match disallowances above a 3% eligibility error rate).</w:t>
       </w:r>
     </w:p>
     <w:p>
@@ -514,7 +514,7 @@
         <w:pStyle w:val="BodyText"/>
       </w:pPr>
       <w:r>
-        <w:t xml:space="preserve">This review asks:</w:t>
+        <w:t xml:space="preserve">The purpose of this review is to answer the question:</w:t>
       </w:r>
       <w:r>
         <w:t xml:space="preserve"> </w:t>
@@ -530,7 +530,7 @@
         <w:t xml:space="preserve"> </w:t>
       </w:r>
       <w:r>
-        <w:t xml:space="preserve">We define accuracy as in the companion Monte Carlo study:</w:t>
+        <w:t xml:space="preserve">This review defines accuracy as in the companion Monte Carlo study:</w:t>
       </w:r>
     </w:p>
     <w:p>
@@ -574,7 +574,7 @@
         <w:t xml:space="preserve"> </w:t>
       </w:r>
       <w:r>
-        <w:t xml:space="preserve">whether the 95% interval contains the truth in about 95% of repeated audits (coverage), and, among intervals that do, how narrow it is (width).</w:t>
+        <w:t xml:space="preserve">whether the 95% interval contains the truth in about 95% of repeated audits (coverage) and, among intervals that do, how narrow the interval is (width).</w:t>
       </w:r>
     </w:p>
     <w:p>
@@ -678,7 +678,7 @@
         <w:t xml:space="preserve"> </w:t>
       </w:r>
       <w:r>
-        <w:t xml:space="preserve">reported under the Payment Integrity Information Act: a program-level ratio with a two-sided confidence interval.</w:t>
+        <w:t xml:space="preserve">reported under the Payment Integrity Information Act, which is a program-level ratio with a two-sided confidence interval.</w:t>
       </w:r>
     </w:p>
     <w:p>
@@ -694,13 +694,13 @@
           <w:bCs/>
           <w:b/>
         </w:rPr>
-        <w:t xml:space="preserve">The contract- or entity-level recovery amount,</w:t>
-      </w:r>
-      <w:r>
-        <w:t xml:space="preserve"> </w:t>
-      </w:r>
-      <w:r>
-        <w:t xml:space="preserve">for example a RADV extrapolation against a Medicare Advantage contract. Here the estimate becomes a legal demand and is usually taken at a lower confidence bound.</w:t>
+        <w:t xml:space="preserve">The contract- or entity-level recovery amount</w:t>
+      </w:r>
+      <w:r>
+        <w:t xml:space="preserve"> </w:t>
+      </w:r>
+      <w:r>
+        <w:t xml:space="preserve">(for example, a RADV extrapolation against a Medicare Advantage contract). In this setting, the estimate becomes a legal demand and is usually taken at a lower confidence bound.</w:t>
       </w:r>
     </w:p>
     <w:p>
@@ -726,7 +726,7 @@
         <w:pStyle w:val="FirstParagraph"/>
       </w:pPr>
       <w:r>
-        <w:t xml:space="preserve">This is a narrative, not systematic, review. Two bodies of evidence were searched and read in full where available:</w:t>
+        <w:t xml:space="preserve">This study is a narrative review (as opposed to a systematic review). Two bodies of evidence were searched and read in full where available:</w:t>
       </w:r>
     </w:p>
     <w:p>
@@ -748,7 +748,7 @@
         <w:t xml:space="preserve"> </w:t>
       </w:r>
       <w:r>
-        <w:t xml:space="preserve">Primary public sources on each program’s design and estimation: statute and OMB guidance; CMS program pages, error-rate findings, methodology documents and manuals; OMB information-collection supporting statements; GAO and OIG reports; and court records on RADV extrapolation.</w:t>
+        <w:t xml:space="preserve">Primary public sources on the design and estimation of each program, including statute and OMB guidance; CMS program pages, error-rate findings, methodology documents, and manuals; OMB information-collection supporting statements; GAO and OIG reports; and court records on RADV extrapolation.</w:t>
       </w:r>
     </w:p>
     <w:p>
@@ -778,7 +778,7 @@
         <w:pStyle w:val="FirstParagraph"/>
       </w:pPr>
       <w:r>
-        <w:t xml:space="preserve">Sources were identified by targeted searches, from the references of key papers (especially Edwards, Liu and Delage 2023; Kvanli and Schauer; Mashreghi, Haziza and Léger 2016), and from CMS methodology documents. Program facts are taken only from public documents current to October 2026; anything that would require non-public contractor methodology plans is flagged as unknown. The review covers the PIIA national rate as its primary target and RADV recovery as context. Sixty-six sources are annotated in the reference list.</w:t>
+        <w:t xml:space="preserve">Sources were identified by targeted searches, from the references of key papers (especially Edwards, Liu and Delage 2023; Kvanli and Schauer; Mashreghi, Haziza and Léger 2016), and from CMS methodology documents. Program facts are taken only from public documents current to October 2026, and anything that would require non-public contractor methodology plans is flagged as unknown. This review covers the PIIA national rate as its primary target and RADV recovery as context. Sixty-six sources are annotated in the reference list.</w:t>
       </w:r>
     </w:p>
     <w:bookmarkEnd w:id="23"/>
@@ -796,7 +796,7 @@
         <w:pStyle w:val="FirstParagraph"/>
       </w:pPr>
       <w:r>
-        <w:t xml:space="preserve">Every estimate in scope exists because the Payment Integrity Information Act of 2019 (PIIA) requires a statistically valid improper payment estimate for programs at risk of significant improper payments, and OMB’s Appendix C to Circular A-123 (</w:t>
+        <w:t xml:space="preserve">Every estimate in scope exists because the Payment Integrity Information Act of 2019 (PIIA) requires a statistically valid improper payment estimate for programs at risk of significant improper payments, and Appendix C to Office of Management and Budget (OMB) Circular A-123 (</w:t>
       </w:r>
       <w:hyperlink r:id="rId24">
         <w:r>
@@ -867,7 +867,7 @@
         <w:t xml:space="preserve">unknown payment</w:t>
       </w:r>
       <w:r>
-        <w:t xml:space="preserve">: one the agency cannot classify as proper or improper because documentation is insufficient. Inspectors General review the plans annually, and interval accuracy is an audited item: the Education OIG has repeatedly found estimates unreliable because nonrandom sampling made the confidence intervals inaccurate (</w:t>
+        <w:t xml:space="preserve">: one the agency cannot classify as proper or improper because documentation is insufficient. Inspectors General review the plans annually, and interval accuracy is an audited item. For example, the Department of Education Office of Inspector General (OIG) has repeatedly found estimates unreliable because nonrandom sampling made the confidence intervals inaccurate (</w:t>
       </w:r>
       <w:hyperlink r:id="rId26">
         <w:r>
@@ -878,7 +878,7 @@
         </w:r>
       </w:hyperlink>
       <w:r>
-        <w:t xml:space="preserve">). That precedent matters here: a change in interval method is something an OIG can test.</w:t>
+        <w:t xml:space="preserve">). This precedent matters here because a change in interval method is something an OIG can test.</w:t>
       </w:r>
     </w:p>
     <w:p>
@@ -936,7 +936,7 @@
         <w:t xml:space="preserve"> </w:t>
       </w:r>
       <w:r>
-        <w:t xml:space="preserve">The Payment Accuracy and Reporting Group (PARG) in CMS’s Office of Financial Management runs improper payment measurement for Medicare FFS, Parts C and D, Medicaid, CHIP and APTC, across 11 contracts and about $115 million a year (</w:t>
+        <w:t xml:space="preserve">The Payment Accuracy and Reporting Group (PARG) in CMS’s Office of Financial Management runs improper payment measurement for Medicare FFS, Parts C and D, Medicaid, CHIP, and APTC, across 11 contracts and about $115 million a year (</w:t>
       </w:r>
       <w:hyperlink r:id="rId29">
         <w:r>
@@ -947,7 +947,7 @@
         </w:r>
       </w:hyperlink>
       <w:r>
-        <w:t xml:space="preserve">). One boundary is worth keeping straight: the national Part C measure is a PARG product, but</w:t>
+        <w:t xml:space="preserve">). One boundary is important to note. The national Part C measure is a PARG product, but</w:t>
       </w:r>
       <w:r>
         <w:t xml:space="preserve"> </w:t>
@@ -1477,7 +1477,7 @@
         </w:r>
       </w:hyperlink>
       <w:r>
-        <w:t xml:space="preserve">). State-based Exchange APTC is not yet measured; HHS plans to start no earlier than January 1, 2027 (</w:t>
+        <w:t xml:space="preserve">). State-based Exchange APTC is not yet measured, and HHS plans to start no earlier than January 1, 2027 (</w:t>
       </w:r>
       <w:hyperlink r:id="rId33">
         <w:r>
@@ -1506,7 +1506,7 @@
         <w:pStyle w:val="FirstParagraph"/>
       </w:pPr>
       <w:r>
-        <w:t xml:space="preserve">Every measure in scope does the same three things: draw a probability sample, establish a payment error for each sampled unit by review, then project (</w:t>
+        <w:t xml:space="preserve">Every measure in scope does the same three things: draw a probability sample, establish a payment error for each sampled unit through review, and then project (</w:t>
       </w:r>
       <w:r>
         <w:t xml:space="preserve">“</w:t>
@@ -1518,7 +1518,7 @@
         <w:t xml:space="preserve">”</w:t>
       </w:r>
       <w:r>
-        <w:t xml:space="preserve">) to the frame and attach an uncertainty statement. The programs differ in the estimator, the variance method and what the interval is</w:t>
+        <w:t xml:space="preserve">) to the frame and attach an uncertainty statement. The programs differ in the estimator, the variance method, and what the interval is</w:t>
       </w:r>
       <w:r>
         <w:t xml:space="preserve"> </w:t>
@@ -1531,7 +1531,7 @@
         <w:t xml:space="preserve">used for</w:t>
       </w:r>
       <w:r>
-        <w:t xml:space="preserve">. Those three choices determine which method is most accurate in each setting.</w:t>
+        <w:t xml:space="preserve">. These three choices determine which method is most accurate in each setting.</w:t>
       </w:r>
     </w:p>
     <w:bookmarkStart w:id="35" w:name="sampling-and-review-vocabulary"/>
@@ -2000,7 +2000,7 @@
         <w:t xml:space="preserve"> </w:t>
       </w:r>
       <w:r>
-        <w:t xml:space="preserve">weights each sampled error by the inverse of its selection probability. It is what 2012 RADV and PIM Chapter 8 contractors use.</w:t>
+        <w:t xml:space="preserve">weights each sampled error by the inverse of its selection probability. This is the estimator used by 2012 RADV and PIM Chapter 8 contractors.</w:t>
       </w:r>
     </w:p>
     <w:p>
@@ -2364,7 +2364,7 @@
         <w:t xml:space="preserve"> </w:t>
       </w:r>
       <w:r>
-        <w:t xml:space="preserve">(PERM, Part C, Part D, APTC) are ratios, so their variance comes from linearization or replication, not the simple formula above. Current RADV (PY 2019 onward) estimates the mean change in risk score, then multiplies by the frame’s summed county rates, a ratio-type estimator in disguise.</w:t>
+        <w:t xml:space="preserve">(PERM, Part C, Part D, APTC) are ratios, so their variance comes from linearization or replication (as opposed to the simple formula above). Current RADV (PY 2019 onward) estimates the mean change in risk score and then multiplies it by the summed county rates of the frame, which is effectively a ratio-type estimator.</w:t>
       </w:r>
     </w:p>
     <w:p>
@@ -2647,7 +2647,7 @@
         <w:t xml:space="preserve"> </w:t>
       </w:r>
       <w:r>
-        <w:t xml:space="preserve">as an auxiliary; they are standard in audit sampling but not documented in the public PARG methods.</w:t>
+        <w:t xml:space="preserve">as an auxiliary variable. These estimators are standard in audit sampling but are not documented in the public PARG methods.</w:t>
       </w:r>
       <w:r>
         <w:t xml:space="preserve"> </w:t>
@@ -2663,7 +2663,7 @@
         <w:t xml:space="preserve"> </w:t>
       </w:r>
       <w:r>
-        <w:t xml:space="preserve">combine separately estimated components: PERM’s overall rate is claims rate plus eligibility rate minus an overlap term, and the national rate rolls three state cycles together.</w:t>
+        <w:t xml:space="preserve">combine separately estimated components. For example, the PERM overall rate is claims rate plus eligibility rate minus an overlap term, and the national rate rolls three state cycles together.</w:t>
       </w:r>
     </w:p>
     <w:bookmarkEnd w:id="36"/>
@@ -3588,7 +3588,7 @@
         <w:pStyle w:val="FirstParagraph"/>
       </w:pPr>
       <w:r>
-        <w:t xml:space="preserve">A third family of methods simulates instead of projecting. In</w:t>
+        <w:t xml:space="preserve">A third family of methods simulates (as opposed to projects). In</w:t>
       </w:r>
       <w:r>
         <w:t xml:space="preserve"> </w:t>
@@ -3601,7 +3601,7 @@
         <w:t xml:space="preserve">audit-finding bootstrap simulation</w:t>
       </w:r>
       <w:r>
-        <w:t xml:space="preserve">, the audit’s findings are assigned at random to the unaudited units of the whole population, the program’s payment function is rerun, and the process is repeated many times. The findings are which HCCs failed, which drug claims were wrong and by how much, and which applications were ineligible. The estimate and interval are read from the distribution of simulated improper payments.</w:t>
+        <w:t xml:space="preserve">, the audit findings are assigned at random to the unaudited units of the whole population, the program’s payment function is rerun, and the process is repeated many times. The findings are which HCCs failed, which drug claims were wrong and by how much, and which applications were ineligible. The estimate and interval are read from the distribution of simulated improper payments.</w:t>
       </w:r>
     </w:p>
     <w:p>
@@ -3609,7 +3609,7 @@
         <w:pStyle w:val="BodyText"/>
       </w:pPr>
       <w:r>
-        <w:t xml:space="preserve">The method has three attractions:</w:t>
+        <w:t xml:space="preserve">This method is attractive for three reasons:</w:t>
       </w:r>
     </w:p>
     <w:p>
@@ -3631,7 +3631,7 @@
         <w:t xml:space="preserve"> </w:t>
       </w:r>
       <w:r>
-        <w:t xml:space="preserve">It reruns the actual payment rules, such as Part D benefit phases, risk-score hierarchies and the APTC schedule.</w:t>
+        <w:t xml:space="preserve">The simulation reruns the actual payment rules (for example, Part D benefit phases, risk-score hierarchies, and the APTC schedule).</w:t>
       </w:r>
     </w:p>
     <w:p>
@@ -3653,7 +3653,7 @@
         <w:t xml:space="preserve"> </w:t>
       </w:r>
       <w:r>
-        <w:t xml:space="preserve">One set of iterations yields over-, under-, gross and net payments and any subgroup.</w:t>
+        <w:t xml:space="preserve">One set of iterations produces over-, under-, gross, and net payments, along with any subgroup.</w:t>
       </w:r>
     </w:p>
     <w:p>
@@ -3683,7 +3683,7 @@
         <w:pStyle w:val="FirstParagraph"/>
       </w:pPr>
       <w:r>
-        <w:t xml:space="preserve">It differs from the survey bootstraps in the table above in one important way: the audit itself is not resampled. Two versions are possible:</w:t>
+        <w:t xml:space="preserve">This method differs from the survey bootstraps in the table above in one important way: the audit itself is not resampled. Two versions are possible:</w:t>
       </w:r>
     </w:p>
     <w:p>
@@ -3705,7 +3705,7 @@
         <w:t xml:space="preserve"> </w:t>
       </w:r>
       <w:r>
-        <w:t xml:space="preserve">the error rates estimated from the audit are reused in every iteration.</w:t>
+        <w:t xml:space="preserve">The error rates estimated from the audit are reused in every iteration.</w:t>
       </w:r>
     </w:p>
     <w:p>
@@ -3727,7 +3727,7 @@
         <w:t xml:space="preserve"> </w:t>
       </w:r>
       <w:r>
-        <w:t xml:space="preserve">the rates are redrawn from their sampling distribution (for example, binomial) before each iteration, which represents the uncertainty of the audit itself (Efron and Tibshirani 1993, ch. 6).</w:t>
+        <w:t xml:space="preserve">The rates are redrawn from their sampling distribution (for example, binomial) before each iteration, which represents the uncertainty of the audit itself (Efron and Tibshirani 1993, ch. 6).</w:t>
       </w:r>
     </w:p>
     <w:p>
@@ -3735,7 +3735,7 @@
         <w:pStyle w:val="FirstParagraph"/>
       </w:pPr>
       <w:r>
-        <w:t xml:space="preserve">Whether either version’s interval holds its nominal coverage is an empirical question taken up in Sections 6 and 8.</w:t>
+        <w:t xml:space="preserve">Whether the interval from either version holds its nominal coverage is an empirical question addressed in Sections 6 and 8.</w:t>
       </w:r>
     </w:p>
     <w:bookmarkEnd w:id="38"/>
@@ -3927,7 +3927,7 @@
         <w:t xml:space="preserve"> </w:t>
       </w:r>
       <w:r>
-        <w:t xml:space="preserve">for both the benefit re-adjudication and the interval iterations, so the word alone does not tell you which is meant.</w:t>
+        <w:t xml:space="preserve">for both the benefit re-adjudication and the interval iterations, so the word alone does not indicate which is meant.</w:t>
       </w:r>
     </w:p>
     <w:bookmarkEnd w:id="39"/>
@@ -3946,7 +3946,7 @@
         <w:pStyle w:val="FirstParagraph"/>
       </w:pPr>
       <w:r>
-        <w:t xml:space="preserve">Only one of the five PIIA measures, Part D, publicly describes a simulation-based interval; the others document (or imply) analytic normal-theory intervals. RADV is the outlier in stakes: small samples, a one-sided decision rule and money changing hands on the result.</w:t>
+        <w:t xml:space="preserve">Only one of the five PIIA measures (Part D) publicly describes a simulation-based interval, while the others document (or imply) analytic normal-theory intervals. RADV is the outlier in terms of stakes, with small samples, a one-sided decision rule, and money changing hands on the result.</w:t>
       </w:r>
     </w:p>
     <w:tbl>
@@ -4709,7 +4709,7 @@
         <w:pStyle w:val="FirstParagraph"/>
       </w:pPr>
       <w:r>
-        <w:t xml:space="preserve">The Part C IPM verifies that HCCs submitted for payment are supported in the medical record for a sampled enrollee, computes enrollee-level payment error, and projects it to the Part C population subject to risk adjustment (</w:t>
+        <w:t xml:space="preserve">The Part C IPM verifies that HCCs submitted for payment are supported in the medical record for a sampled enrollee, computes the enrollee-level payment error, and projects this error to the Part C population subject to risk adjustment (</w:t>
       </w:r>
       <w:hyperlink r:id="rId41">
         <w:r>
@@ -4720,7 +4720,7 @@
         </w:r>
       </w:hyperlink>
       <w:r>
-        <w:t xml:space="preserve">). The FY 2025 rate was 6.09% ($23.67B gross, $19.20B net) on a $388.72B denominator; missing documentation was only 0.22% of expenditures (</w:t>
+        <w:t xml:space="preserve">). The FY 2025 rate was 6.09% ($23.67B gross, $19.20B net) on a $388.72B denominator, and missing documentation was only 0.22% of expenditures (</w:t>
       </w:r>
       <w:hyperlink r:id="rId42">
         <w:r>
@@ -4731,7 +4731,7 @@
         </w:r>
       </w:hyperlink>
       <w:r>
-        <w:t xml:space="preserve">). Two definitional changes moved the series:</w:t>
+        <w:t xml:space="preserve">). Two definitional changes affected the series.</w:t>
       </w:r>
       <w:r>
         <w:t xml:space="preserve"> </w:t>
@@ -4740,7 +4740,7 @@
         <w:t xml:space="preserve">“</w:t>
       </w:r>
       <w:r>
-        <w:t xml:space="preserve">spontaneous</w:t>
+        <w:t xml:space="preserve">Spontaneous</w:t>
       </w:r>
       <w:r>
         <w:t xml:space="preserve">”</w:t>
@@ -4749,7 +4749,7 @@
         <w:t xml:space="preserve"> </w:t>
       </w:r>
       <w:r>
-        <w:t xml:space="preserve">additional HCCs left the underpayment calculation from CY 2020, and ESRD and hospice enrollees entered the sample from FY 2024.</w:t>
+        <w:t xml:space="preserve">additional HCCs were removed from the underpayment calculation beginning in CY 2020, and ESRD and hospice enrollees entered the sample beginning in FY 2024.</w:t>
       </w:r>
     </w:p>
     <w:p>
@@ -5187,7 +5187,7 @@
         <w:pStyle w:val="BodyText"/>
       </w:pPr>
       <w:r>
-        <w:t xml:space="preserve">The legal footing is unsettled. The 2023 RADV rule (no FFS adjuster; extrapolation from PY 2018) was vacated in</w:t>
+        <w:t xml:space="preserve">The legal basis for these audits is unsettled. The 2023 RADV rule (no FFS adjuster; extrapolation from PY 2018) was vacated in</w:t>
       </w:r>
       <w:r>
         <w:t xml:space="preserve"> </w:t>
@@ -5214,7 +5214,7 @@
         </w:r>
       </w:hyperlink>
       <w:r>
-        <w:t xml:space="preserve">); the government appealed, and a Fifth Circuit panel heard argument on October 5, 2026 and appeared skeptical of the government’s position (</w:t>
+        <w:t xml:space="preserve">). The government appealed, and a Fifth Circuit panel heard argument on October 5, 2026, and appeared skeptical of the government’s position (</w:t>
       </w:r>
       <w:hyperlink r:id="rId47">
         <w:r>
@@ -5225,7 +5225,7 @@
         </w:r>
       </w:hyperlink>
       <w:r>
-        <w:t xml:space="preserve">). Meanwhile CMS plans to audit all ~550 eligible contracts a year (</w:t>
+        <w:t xml:space="preserve">). Meanwhile, CMS plans to audit all ~550 eligible contracts a year (</w:t>
       </w:r>
       <w:hyperlink r:id="rId48">
         <w:r>
@@ -5236,7 +5236,7 @@
         </w:r>
       </w:hyperlink>
       <w:r>
-        <w:t xml:space="preserve">). Whatever the court decides, the estimator and bound will be argued over contract by contract, which is exactly where coverage evidence matters.</w:t>
+        <w:t xml:space="preserve">). Regardless of the court’s decision, the estimator and bound will likely be argued over contract by contract, which is exactly where coverage evidence matters.</w:t>
       </w:r>
     </w:p>
     <w:bookmarkEnd w:id="49"/>
@@ -5308,7 +5308,7 @@
         </w:r>
       </w:hyperlink>
       <w:r>
-        <w:t xml:space="preserve">). FY 2025 moved from cohort to random beneficiary selection.</w:t>
+        <w:t xml:space="preserve">). In FY 2025, the program moved from cohort to random beneficiary selection.</w:t>
       </w:r>
     </w:p>
     <w:p>
@@ -5327,7 +5327,7 @@
         </w:r>
       </w:hyperlink>
       <w:r>
-        <w:t xml:space="preserve">). That pattern is what a percentile-type resampling interval on a right-skewed error distribution produces. Public documents do not name the algorithm, so the internal S&amp;EMP is the authority here. Missing or invalid documentation was 75% of sampled errors in FY 2025, which makes the error distribution closer to all-or-nothing than to small pricing discrepancies.</w:t>
+        <w:t xml:space="preserve">). This pattern is consistent with what a percentile-type resampling interval on a right-skewed error distribution produces. Public documents do not name the algorithm, so the internal S&amp;EMP is the authority on this point. Missing or invalid documentation was 75% of sampled errors in FY 2025, which makes the error distribution closer to all-or-nothing than to small pricing discrepancies.</w:t>
       </w:r>
     </w:p>
     <w:bookmarkEnd w:id="54"/>
@@ -5381,7 +5381,7 @@
         </w:r>
       </w:hyperlink>
       <w:r>
-        <w:t xml:space="preserve">). Each component rate is projected improper dollars over projected paid dollars; the overall rate adds the eligibility rate to the claims rate and subtracts their overlap (</w:t>
+        <w:t xml:space="preserve">). Each component rate is projected improper dollars over projected paid dollars, and the overall rate adds the eligibility rate to the claims rate and subtracts their overlap (</w:t>
       </w:r>
       <w:hyperlink r:id="rId58">
         <w:r>
@@ -5411,7 +5411,7 @@
         </w:r>
       </w:hyperlink>
       <w:r>
-        <w:t xml:space="preserve">). A state eligibility rate near 3% now carries a dollar consequence, so its interval behaves like a recovery bound, not just a reporting statistic. RY 2027 measures eligibility only (</w:t>
+        <w:t xml:space="preserve">). A state eligibility rate near 3% now carries a dollar consequence, so its interval behaves like a recovery bound (as opposed to only a reporting statistic). RY 2027 measures eligibility only (</w:t>
       </w:r>
       <w:hyperlink r:id="rId60">
         <w:r>
@@ -5481,7 +5481,7 @@
         <w:t xml:space="preserve"> </w:t>
       </w:r>
       <w:r>
-        <w:t xml:space="preserve">payments, where a required periodic data match was not run. The remainder came from manual errors such as income entered incorrectly or documents accepted despite name or date-of-birth discrepancies (</w:t>
+        <w:t xml:space="preserve">payments, where a required periodic data match was not run. The remainder came from manual errors (for example, income entered incorrectly or documents accepted despite name or date-of-birth discrepancies) (</w:t>
       </w:r>
       <w:hyperlink r:id="rId63">
         <w:r>
@@ -5492,7 +5492,7 @@
         </w:r>
       </w:hyperlink>
       <w:r>
-        <w:t xml:space="preserve">). At that rate a 2,000-unit sample holds only a few dozen errors, the regime in which normal-theory bounds are least reliable. State-based Exchanges come under a separate SEIPM rule (45 CFR 155 Subpart Q) with state-specific sample sizes and a three-year cycle, no earlier than January 1, 2027.</w:t>
+        <w:t xml:space="preserve">). At this rate, a 2,000-unit sample contains only a few dozen errors, which is the setting in which normal-theory bounds are least reliable. State-based Exchanges come under a separate SEIPM rule (45 CFR 155 Subpart Q) with state-specific sample sizes and a three-year cycle, no earlier than January 1, 2027.</w:t>
       </w:r>
     </w:p>
     <w:bookmarkEnd w:id="64"/>
@@ -5543,7 +5543,7 @@
         <w:t xml:space="preserve"> </w:t>
       </w:r>
       <w:r>
-        <w:t xml:space="preserve">The first level is claim type: Part A hospital IPPS, Part A excluding IPPS, Part B and DMEPOS. Within each type there are about 100 service-level strata; Part A excluding IPPS uses two-digit type-of-bill strata, fewer than 20 (</w:t>
+        <w:t xml:space="preserve">The first level is claim type (Part A hospital IPPS, Part A excluding IPPS, Part B, and DMEPOS). Within each type, there are about 100 service-level strata, and Part A excluding IPPS uses two-digit type-of-bill strata, fewer than 20 (</w:t>
       </w:r>
       <w:hyperlink r:id="rId65">
         <w:r>
@@ -5576,7 +5576,7 @@
         <w:t xml:space="preserve"> </w:t>
       </w:r>
       <w:r>
-        <w:t xml:space="preserve">A generalized estimator gives national, contractor-cluster and service-level rates. At the national level it reduces to the separate ratio estimator, with contractor clusters weighted by their share of expenditures.</w:t>
+        <w:t xml:space="preserve">A generalized estimator produces national, contractor-cluster, and service-level rates. At the national level it reduces to the separate ratio estimator, with contractor clusters weighted by their share of expenditures.</w:t>
       </w:r>
     </w:p>
     <w:p>
@@ -5653,7 +5653,7 @@
         <w:t xml:space="preserve"> </w:t>
       </w:r>
       <w:r>
-        <w:t xml:space="preserve">Insufficient documentation accounted for 53% of improper dollars, medical necessity 15%, no documentation 12%, incorrect coding 11% and other 8.5%.</w:t>
+        <w:t xml:space="preserve">Insufficient documentation accounted for 53% of improper dollars, medical necessity 15%, no documentation 12%, incorrect coding 11%, and other 8.5%.</w:t>
       </w:r>
     </w:p>
     <w:p>
@@ -5661,7 +5661,7 @@
         <w:pStyle w:val="FirstParagraph"/>
       </w:pPr>
       <w:r>
-        <w:t xml:space="preserve">Most CERT errors are therefore whole-claim, all-or-nothing errors, with partial errors coming mainly from coding. That is the Edwards, Liu and Delage (2023) error regime, but at a national sample size where the central limit theorem has far more to work with than in a 30-claim provider audit.</w:t>
+        <w:t xml:space="preserve">Most CERT errors are therefore whole-claim, all-or-nothing errors, with partial errors coming mainly from coding. This is the error setting studied by Edwards, Liu and Delage (2023), but at a national sample size where the central limit theorem has far more to work with than in a 30-claim provider audit.</w:t>
       </w:r>
     </w:p>
     <w:p>
@@ -5685,7 +5685,7 @@
         <w:pStyle w:val="Compact"/>
       </w:pPr>
       <w:r>
-        <w:t xml:space="preserve">the Part C IPM sample size, strata and interval method;</w:t>
+        <w:t xml:space="preserve">the Part C IPM sample size, strata, and interval method;</w:t>
       </w:r>
     </w:p>
     <w:p>
@@ -5752,7 +5752,7 @@
         <w:pStyle w:val="FirstParagraph"/>
       </w:pPr>
       <w:r>
-        <w:t xml:space="preserve">The literature converges on one rule: whether an interval holds its nominal coverage depends mainly on the skew of the error distribution and the number of nonzero errors in the sample, not on the method’s name. Bootstrap intervals repair the low-error, right-skew failure well; they have barely been tested in the high-error, all-or-nothing regime that Medicare reviews actually produce.</w:t>
+        <w:t xml:space="preserve">The literature converges on one rule: whether an interval holds its nominal coverage depends mainly on the skew of the error distribution and the number of nonzero errors in the sample (as opposed to the name of the method). Bootstrap intervals correct the low-error, right-skew failure well. However, they have barely been tested in the high-error, all-or-nothing setting that Medicare reviews actually produce.</w:t>
       </w:r>
     </w:p>
     <w:bookmarkStart w:id="72" w:name="normal-theory-intervals"/>
@@ -5783,7 +5783,7 @@
         <w:t xml:space="preserve"> </w:t>
       </w:r>
       <w:r>
-        <w:t xml:space="preserve">A right-skewed population yields a conservative lower bound and a liberal upper bound; a left-skewed one reverses this (Cochran 1977, as applied by</w:t>
+        <w:t xml:space="preserve">A right-skewed population produces a conservative lower bound and a liberal upper bound, and a left-skewed population reverses this pattern (Cochran 1977, as applied by</w:t>
       </w:r>
       <w:r>
         <w:t xml:space="preserve"> </w:t>
@@ -5797,7 +5797,7 @@
         </w:r>
       </w:hyperlink>
       <w:r>
-        <w:t xml:space="preserve">). Overpayment populations are a spike at zero plus a payment-shaped tail, so their skew flips as the error rate rises.</w:t>
+        <w:t xml:space="preserve">). Overpayment populations are a spike at zero plus a payment-shaped tail, so their skew reverses as the error rate rises.</w:t>
       </w:r>
     </w:p>
     <w:p>
@@ -5819,7 +5819,7 @@
         <w:t xml:space="preserve"> </w:t>
       </w:r>
       <w:r>
-        <w:t xml:space="preserve">With few nonzero errors, normal lower limits sit far below the truth. In Kvanli and Schauer’s simulations, the traditional 90% interval’s lower limit exceeded the true total in only 0.3–2.3% of samples against a nominal 5% (</w:t>
+        <w:t xml:space="preserve">With few nonzero errors, normal lower limits sit far below the truth. In Kvanli and Schauer’s simulations, the traditional 90% interval’s lower limit exceeded the true total in only 0.3–2.3% of samples as opposed to a nominal 5% (</w:t>
       </w:r>
       <w:hyperlink r:id="rId70">
         <w:r>
@@ -5852,7 +5852,7 @@
         <w:t xml:space="preserve"> </w:t>
       </w:r>
       <w:r>
-        <w:t xml:space="preserve">In 166 Medicare integrity samples, more than 76% of payments were in error and the data fit an all-or-nothing model. Under that model a simple random sample of 30 fell below 90% confidence once the error rate passed 0.6 for two of three test populations, and no stratification algorithm tested was viable for more than about half of 104 populations (Edwards et al. 2023). At very high error rates the bound can even exceed total payments.</w:t>
+        <w:t xml:space="preserve">In 166 Medicare integrity samples, more than 76% of payments were in error and the data fit an all-or-nothing model. Under this model, a simple random sample of 30 fell below 90% confidence once the error rate passed 0.6 for two of three test populations, and no stratification algorithm tested was viable for more than about half of 104 populations (Edwards et al. 2023). At very high error rates, the bound can even exceed total payments.</w:t>
       </w:r>
     </w:p>
     <w:p>
@@ -5874,7 +5874,7 @@
         <w:t xml:space="preserve"> </w:t>
       </w:r>
       <w:r>
-        <w:t xml:space="preserve">Payment-based strata create left-skewed overpayment strata at high error rates; King and Madansky (2013) warn that careless stratification can invalidate the confidence coefficient itself.</w:t>
+        <w:t xml:space="preserve">Payment-based strata create left-skewed overpayment strata at high error rates, and King and Madansky (2013) warn that careless stratification can invalidate the confidence coefficient itself.</w:t>
       </w:r>
     </w:p>
     <w:p>
@@ -5914,7 +5914,7 @@
         <w:t xml:space="preserve"> </w:t>
       </w:r>
       <w:r>
-        <w:t xml:space="preserve">from texts and journals but concedes 90% coverage cannot be guaranteed in every audit (</w:t>
+        <w:t xml:space="preserve">from texts and journals but acknowledges that 90% coverage cannot be guaranteed in every audit (</w:t>
       </w:r>
       <w:hyperlink r:id="rId71">
         <w:r>
@@ -5957,7 +5957,7 @@
         <w:t xml:space="preserve"> </w:t>
       </w:r>
       <w:r>
-        <w:t xml:space="preserve">Percentile intervals are first-order accurate; BCa and bootstrap-</w:t>
+        <w:t xml:space="preserve">Percentile intervals are first-order accurate, while BCa and bootstrap-</w:t>
       </w:r>
       <w:r>
         <w:rPr>
@@ -5996,7 +5996,7 @@
         <w:t xml:space="preserve"> </w:t>
       </w:r>
       <w:r>
-        <w:t xml:space="preserve">(Hall 1988; Efron 1987; DiCiccio &amp; Efron 1996). In small samples the percentile interval is too narrow, and bootstrap-</w:t>
+        <w:t xml:space="preserve">(Hall 1988; Efron 1987; DiCiccio &amp; Efron 1996). In small samples, the percentile interval is too narrow, and bootstrap-</w:t>
       </w:r>
       <w:r>
         <w:rPr>
@@ -6031,7 +6031,7 @@
         <w:t xml:space="preserve"> </w:t>
       </w:r>
       <w:r>
-        <w:t xml:space="preserve">Kvanli and Schauer found BCa lower limits exceeded the truth in 3.2–4.5% of samples (nominal 5%), much closer than the traditional method, with average lower limits 6–530% higher depending on the expected number of errors. The gain fades after roughly 30 nonzero errors in the sample, where both methods agree. On twelve real tax-audit samples, BCa lower limits were 3–548% higher.</w:t>
+        <w:t xml:space="preserve">Kvanli and Schauer found BCa lower limits exceeded the truth in 3.2–4.5% of samples (nominal 5%), much closer than the traditional method, with average lower limits 6–530% higher depending on the expected number of errors. The gain fades after roughly 30 nonzero errors in the sample, at which point both methods agree. On twelve real tax-audit samples, BCa lower limits were 3–548% higher.</w:t>
       </w:r>
     </w:p>
     <w:p>
@@ -6208,7 +6208,7 @@
         <w:pStyle w:val="BodyText"/>
       </w:pPr>
       <w:r>
-        <w:t xml:space="preserve">Even at 60 expected errors the normal-theory bound misses less than half as often as it should, so it under-recovers; BCa stays slightly conservative throughout. Populations had 2%, 5% and 10% error rates with exponential error sizes and 5,000 samples per cell.</w:t>
+        <w:t xml:space="preserve">Even at 60 expected errors, the normal-theory bound misses less than half as often as it should, so it under-recovers. In contrast, BCa remains slightly conservative throughout. Populations had 2%, 5%, and 10% error rates with exponential error sizes and 5,000 samples per cell.</w:t>
       </w:r>
     </w:p>
     <w:p>
@@ -6264,7 +6264,7 @@
         <w:t xml:space="preserve"> </w:t>
       </w:r>
       <w:r>
-        <w:t xml:space="preserve">Resampling cannot produce values outside the observed support and inherits the sample’s skew; whether that fixes the normal bound’s liberal behavior at error rates above 0.6 has not been published for Medicare data.</w:t>
+        <w:t xml:space="preserve">Resampling cannot produce values outside the observed support and inherits the skew of the sample. Whether this corrects the normal bound’s liberal behavior at error rates above 0.6 has not been published for Medicare data.</w:t>
       </w:r>
     </w:p>
     <w:p>
@@ -6286,7 +6286,7 @@
         <w:t xml:space="preserve"> </w:t>
       </w:r>
       <w:r>
-        <w:t xml:space="preserve">Rescaling needs at least two units per stratum; PERM’s sorted systematic selection has no exact design-based variance, so any bootstrap treats it as implicitly stratified.</w:t>
+        <w:t xml:space="preserve">Rescaling requires at least two units per stratum, and the sorted systematic selection used by PERM has no exact design-based variance, so any bootstrap treats it as implicitly stratified.</w:t>
       </w:r>
     </w:p>
     <w:p>
@@ -6308,7 +6308,7 @@
         <w:t xml:space="preserve"> </w:t>
       </w:r>
       <w:r>
-        <w:t xml:space="preserve">RADV PY 2019+ frames are chosen by a prediction model, so inference applies only to the frame. A bootstrap inside the frame is valid; extrapolating its interval beyond the frame is not.</w:t>
+        <w:t xml:space="preserve">RADV PY 2019+ frames are chosen by a prediction model, so inference applies only to the frame. A bootstrap inside the frame is valid, but extrapolating its interval beyond the frame is not.</w:t>
       </w:r>
     </w:p>
     <w:p>
@@ -6330,7 +6330,7 @@
         <w:t xml:space="preserve"> </w:t>
       </w:r>
       <w:r>
-        <w:t xml:space="preserve">Rolling PERM rates and claims-plus-eligibility composites require resampling each phase and component on its own design, then recombining; correlations between components (the overlap term) must be carried through.</w:t>
+        <w:t xml:space="preserve">Rolling PERM rates and claims-plus-eligibility composites require resampling each phase and component on its own design, and then recombining them. Correlations between components (the overlap term) must be carried through.</w:t>
       </w:r>
     </w:p>
     <w:p>
@@ -6352,7 +6352,7 @@
         <w:t xml:space="preserve"> </w:t>
       </w:r>
       <w:r>
-        <w:t xml:space="preserve">Tail quantiles need thousands of replicates, and appeals require that the result be replicable, so the seed, replicate count and Monte Carlo error must be documented as PIM §8.4.4.2 already requires for sample selection.</w:t>
+        <w:t xml:space="preserve">Tail quantiles need thousands of replicates, and appeals require that the result be replicable, so the seed, replicate count, and Monte Carlo error must be documented as PIM §8.4.4.2 already requires for sample selection.</w:t>
       </w:r>
     </w:p>
     <w:bookmarkEnd w:id="79"/>
@@ -6801,7 +6801,7 @@
         <w:pStyle w:val="FirstParagraph"/>
       </w:pPr>
       <w:r>
-        <w:t xml:space="preserve">This covers analytic, bootstrap and audit-finding simulation methods alike. The closest evidence comes from Medicare FFS provider audits (high error, all-or-nothing) and tax and accounting audits (low error, right skew). The CMS programs span both regimes. Nor has the validity of audit-finding simulation intervals, with or without uncertainty in the rates, been tested.</w:t>
+        <w:t xml:space="preserve">This gap applies to analytic, bootstrap, and audit-finding simulation methods alike. The closest evidence comes from Medicare FFS provider audits (high error, all-or-nothing) and tax and accounting audits (low error, right skew). The CMS programs span both settings. In addition, the validity of audit-finding simulation intervals (with or without uncertainty in the rates) has not been tested.</w:t>
       </w:r>
     </w:p>
     <w:bookmarkEnd w:id="81"/>
@@ -6820,7 +6820,7 @@
         <w:pStyle w:val="FirstParagraph"/>
       </w:pPr>
       <w:r>
-        <w:t xml:space="preserve">The case for bootstrap is strongest where samples are small, errors are skewed and an interval drives a dollar decision: RADV first, then PERM state eligibility rates, then EIPM. Part D already relies on simulation, so its question is validation rather than adoption. Part C IPM gains least.</w:t>
+        <w:t xml:space="preserve">The case for the bootstrap is strongest where samples are small, errors are skewed, and an interval drives a dollar decision (RADV first, then PERM state eligibility rates, and then EIPM). Part D already relies on simulation, so the question for Part D is validation (as opposed to adoption). Part C IPM gains the least.</w:t>
       </w:r>
     </w:p>
     <w:tbl>
@@ -7401,7 +7401,7 @@
         <w:pStyle w:val="Compact"/>
       </w:pPr>
       <w:r>
-        <w:t xml:space="preserve">The PY 2021 estimator is a ratio over enrollee-months; resampling enrollees (with all their months and HCCs) gets its variance without the linearization step.</w:t>
+        <w:t xml:space="preserve">The PY 2021 estimator is a ratio over enrollee-months. Resampling enrollees (with all their months and HCCs) produces its variance without the linearization step.</w:t>
       </w:r>
     </w:p>
     <w:p>
@@ -7413,7 +7413,7 @@
         <w:pStyle w:val="Compact"/>
       </w:pPr>
       <w:r>
-        <w:t xml:space="preserve">Resampling can bound the dollar payment error directly, including county-rate weighting, rather than bounding mean risk-score change and multiplying afterward.</w:t>
+        <w:t xml:space="preserve">Resampling can bound the dollar payment error directly, including county-rate weighting (as opposed to bounding the mean risk-score change and multiplying afterward).</w:t>
       </w:r>
     </w:p>
     <w:p>
@@ -7437,7 +7437,7 @@
         <w:pStyle w:val="Compact"/>
       </w:pPr>
       <w:r>
-        <w:t xml:space="preserve">The decision rule is one-sided: extrapolate if the bound exceeds zero, then recover the point estimate. What matters is the false-extrapolation rate when the true mean change is at or below zero, and at</w:t>
+        <w:t xml:space="preserve">The decision rule is one-sided: extrapolate if the bound exceeds zero, and then recover the point estimate. What matters is the false-extrapolation rate when the true mean change is at or below zero. At</w:t>
       </w:r>
       <w:r>
         <w:t xml:space="preserve"> </w:t>
@@ -7453,7 +7453,7 @@
         <w:t xml:space="preserve"> </w:t>
       </w:r>
       <w:r>
-        <w:t xml:space="preserve">= 35 percentile intervals are known to be too narrow, which would</w:t>
+        <w:t xml:space="preserve">= 35, percentile intervals are known to be too narrow, which would</w:t>
       </w:r>
       <w:r>
         <w:t xml:space="preserve"> </w:t>
@@ -7469,7 +7469,7 @@
         <w:t xml:space="preserve"> </w:t>
       </w:r>
       <w:r>
-        <w:t xml:space="preserve">that rate.</w:t>
+        <w:t xml:space="preserve">this rate.</w:t>
       </w:r>
     </w:p>
     <w:p>
@@ -7497,7 +7497,7 @@
         <w:t xml:space="preserve"> </w:t>
       </w:r>
       <w:r>
-        <w:t xml:space="preserve">bound, as in Kvanli and Schauer. That would shift recoveries upward and invite challenge.</w:t>
+        <w:t xml:space="preserve">bound, as in Kvanli and Schauer. This would shift recoveries upward and would likely invite challenge.</w:t>
       </w:r>
     </w:p>
     <w:p>
@@ -7509,7 +7509,7 @@
         <w:pStyle w:val="Compact"/>
       </w:pPr>
       <w:r>
-        <w:t xml:space="preserve">Inference applies only to the prediction-model frame; the bootstrap cannot fix frame definition or the FFS-adjuster dispute.</w:t>
+        <w:t xml:space="preserve">Inference applies only to the prediction-model frame, and the bootstrap cannot resolve the frame definition or the FFS-adjuster dispute.</w:t>
       </w:r>
     </w:p>
     <w:p>
@@ -7521,7 +7521,7 @@
         <w:pStyle w:val="Compact"/>
       </w:pPr>
       <w:r>
-        <w:t xml:space="preserve">A method change mid-litigation is itself a legal event; any bootstrap must be fully replicable from a documented seed.</w:t>
+        <w:t xml:space="preserve">A method change during litigation is itself a legal event, so any bootstrap must be fully replicable from a documented seed.</w:t>
       </w:r>
     </w:p>
     <w:p>
@@ -7539,7 +7539,7 @@
         <w:t xml:space="preserve"> </w:t>
       </w:r>
       <w:r>
-        <w:t xml:space="preserve">Treat each contract as SRS without replacement from its frame; use a pseudo-population or rescaled bootstrap so the FPC is honored when</w:t>
+        <w:t xml:space="preserve">Each contract should be treated as SRS without replacement from its frame, using a pseudo-population or rescaled bootstrap so that the FPC is honored when</w:t>
       </w:r>
       <w:r>
         <w:t xml:space="preserve"> </w:t>
@@ -7565,7 +7565,7 @@
         <w:t xml:space="preserve"> </w:t>
       </w:r>
       <w:r>
-        <w:t xml:space="preserve">is large (frames can be as small as 30). Resample enrollees as clusters, compute the month-weighted mean change and the dollar estimate in each replicate, and form bootstrap-</w:t>
+        <w:t xml:space="preserve">is large (frames can be as small as 30). Enrollees should be resampled as clusters, the month-weighted mean change and the dollar estimate computed in each replicate, and bootstrap-</w:t>
       </w:r>
       <w:r>
         <w:rPr>
@@ -7578,7 +7578,7 @@
         <w:t xml:space="preserve"> </w:t>
       </w:r>
       <w:r>
-        <w:t xml:space="preserve">and BCa bounds with at least 5,000 replicates. Report the probability that the bound exceeds zero alongside the bound.</w:t>
+        <w:t xml:space="preserve">and BCa bounds formed with at least 5,000 replicates. The probability that the bound exceeds zero should be reported alongside the bound.</w:t>
       </w:r>
     </w:p>
     <w:bookmarkEnd w:id="83"/>
@@ -7622,7 +7622,7 @@
         <w:t xml:space="preserve"> </w:t>
       </w:r>
       <w:r>
-        <w:t xml:space="preserve">The national sample is large and stratified, so the CLT should hold and coverage gains will be small.</w:t>
+        <w:t xml:space="preserve">The national sample is large and stratified, so the CLT should hold, and coverage gains will likely be small.</w:t>
       </w:r>
       <w:r>
         <w:t xml:space="preserve"> </w:t>
@@ -7638,7 +7638,7 @@
         <w:t xml:space="preserve"> </w:t>
       </w:r>
       <w:r>
-        <w:t xml:space="preserve">Rao–Wu–Yue rescaled bootstrap within risk strata (resampling</w:t>
+        <w:t xml:space="preserve">The recommended approach is a Rao–Wu–Yue rescaled bootstrap within risk strata (resampling</w:t>
       </w:r>
       <w:r>
         <w:t xml:space="preserve"> </w:t>
@@ -7651,7 +7651,7 @@
         <w:t xml:space="preserve">n</w:t>
       </w:r>
       <w:r>
-        <w:t xml:space="preserve">ₕ−1 per stratum), percentile and BCa intervals compared against the current method; useful mainly as a cross-check and for domains.</w:t>
+        <w:t xml:space="preserve">ₕ−1 per stratum), with percentile and BCa intervals compared against the current method. This would be useful mainly as a cross-check and for domains.</w:t>
       </w:r>
     </w:p>
     <w:bookmarkEnd w:id="84"/>
@@ -7679,7 +7679,7 @@
         <w:t xml:space="preserve"> </w:t>
       </w:r>
       <w:r>
-        <w:t xml:space="preserve">The estimator is a nonlinear simulation (corrected PDEs re-run through benefit phases and reinsurance), so linearization is impractical and resampling is the natural variance method; the asymmetric published intervals suggest this is already the approach.</w:t>
+        <w:t xml:space="preserve">The estimator is a nonlinear simulation (corrected PDEs re-run through benefit phases and reinsurance), so linearization is impractical, and resampling is the natural variance method. The asymmetric published intervals suggest that this is already the approach.</w:t>
       </w:r>
     </w:p>
     <w:p>
@@ -7713,7 +7713,7 @@
         <w:t xml:space="preserve"> </w:t>
       </w:r>
       <w:r>
-        <w:t xml:space="preserve">Resampling beneficiaries after their payment errors are computed is cheap and valid if each beneficiary’s simulated error is fixed. Re-running the benefit simulation inside each replicate is only needed if the simulation itself has stochastic inputs.</w:t>
+        <w:t xml:space="preserve">Resampling beneficiaries after their payment errors are computed is inexpensive and valid if the simulated error of each beneficiary is fixed. Re-running the benefit simulation inside each replicate is only needed if the simulation itself has stochastic inputs.</w:t>
       </w:r>
     </w:p>
     <w:p>
@@ -7735,7 +7735,7 @@
         <w:t xml:space="preserve"> </w:t>
       </w:r>
       <w:r>
-        <w:t xml:space="preserve">The FY 2023 cut in simulation iterations needs a Monte Carlo error target for the 2.5% and 97.5% quantiles, not just for the standard error.</w:t>
+        <w:t xml:space="preserve">The FY 2023 cut in simulation iterations needs a Monte Carlo error target for the 2.5% and 97.5% quantiles (as opposed to only the standard error).</w:t>
       </w:r>
     </w:p>
     <w:p>
@@ -7797,7 +7797,7 @@
         <w:t xml:space="preserve"> </w:t>
       </w:r>
       <w:r>
-        <w:t xml:space="preserve">Validate rather than replace: build a synthetic beneficiary population from historical PDE and error data, repeat the full sampling-review-simulation pipeline, and measure coverage and tail balance of the current interval against BCa and bootstrap-</w:t>
+        <w:t xml:space="preserve">The current method should be validated (as opposed to replaced) by building a synthetic beneficiary population from historical PDE and error data, repeating the full sampling-review-simulation pipeline, and measuring the coverage and tail balance of the current interval against BCa and bootstrap-</w:t>
       </w:r>
       <w:r>
         <w:rPr>
@@ -7841,7 +7841,7 @@
         <w:pStyle w:val="Compact"/>
       </w:pPr>
       <w:r>
-        <w:t xml:space="preserve">The overall rate is a composite (FFS + managed care + eligibility − overlap, at federal share) and the national rate pools three cycles. Replicate weights carry every covariance through without hand-derived formulas.</w:t>
+        <w:t xml:space="preserve">The overall rate is a composite (FFS + managed care + eligibility − overlap, at federal share), and the national rate pools three cycles. Replicate weights carry every covariance through without hand-derived formulas.</w:t>
       </w:r>
     </w:p>
     <w:p>
@@ -7853,7 +7853,7 @@
         <w:pStyle w:val="Compact"/>
       </w:pPr>
       <w:r>
-        <w:t xml:space="preserve">From FY 2030 a state eligibility rate above 3% triggers disallowance. With a few hundred cases per state, a one-sided bound near 3% needs calibrated coverage, and whether the statute’s</w:t>
+        <w:t xml:space="preserve">Beginning in FY 2030, a state eligibility rate above 3% triggers disallowance. With a few hundred cases per state, a one-sided bound near 3% needs calibrated coverage, and whether the statute’s</w:t>
       </w:r>
       <w:r>
         <w:t xml:space="preserve"> </w:t>
@@ -7889,7 +7889,7 @@
         <w:t xml:space="preserve"> </w:t>
       </w:r>
       <w:r>
-        <w:t xml:space="preserve">Systematic selection after sorting by paid amount has no exact variance estimator; eligibility cases are a second phase attached to sampled payments; difference resolution and appeals change findings after sampling; and the three cycles measure different years.</w:t>
+        <w:t xml:space="preserve">Systematic selection after sorting by paid amount has no exact variance estimator. In addition, eligibility cases are a second phase attached to sampled payments, difference resolution and appeals change findings after sampling, and the three cycles measure different years.</w:t>
       </w:r>
     </w:p>
     <w:p>
@@ -7907,7 +7907,7 @@
         <w:t xml:space="preserve"> </w:t>
       </w:r>
       <w:r>
-        <w:t xml:space="preserve">Generate replicate weights per state at selection time, treating sorted systematic samples as implicitly stratified (paired adjacent units); resample the eligibility phase within the sampled payments; compute each component and the composite per replicate. Because states are sampled independently, national replicates come from summing state replicate totals.</w:t>
+        <w:t xml:space="preserve">Replicate weights should be generated per state at selection time, treating sorted systematic samples as implicitly stratified (paired adjacent units). The eligibility phase should then be resampled within the sampled payments, and each component and the composite computed per replicate. Because states are sampled independently, national replicates come from summing state replicate totals.</w:t>
       </w:r>
     </w:p>
     <w:bookmarkEnd w:id="86"/>
@@ -7935,7 +7935,7 @@
         <w:t xml:space="preserve"> </w:t>
       </w:r>
       <w:r>
-        <w:t xml:space="preserve">At an error rate under 1%, a 2,000-application sample sits squarely in the rare-error regime where normal upper bounds are liberal and lower bounds conservative; BCa helps both tails. SBE measurement from 2027 will produce smaller state samples where this matters more.</w:t>
+        <w:t xml:space="preserve">At an error rate under 1%, a 2,000-application sample sits squarely in the rare-error setting where normal upper bounds are liberal and lower bounds are conservative, and BCa helps both tails. SBE measurement beginning in 2027 will produce smaller state samples where this matters more.</w:t>
       </w:r>
     </w:p>
     <w:p>
@@ -7953,7 +7953,7 @@
         <w:t xml:space="preserve"> </w:t>
       </w:r>
       <w:r>
-        <w:t xml:space="preserve">Strata with zero observed errors give degenerate resamples; household-level APTC errors are bounded by the monthly APTC and may be all-or-nothing when eligibility fails.</w:t>
+        <w:t xml:space="preserve">Strata with zero observed errors produce degenerate resamples, and household-level APTC errors are bounded by the monthly APTC and may be all-or-nothing when eligibility fails.</w:t>
       </w:r>
     </w:p>
     <w:p>
@@ -7971,7 +7971,7 @@
         <w:t xml:space="preserve"> </w:t>
       </w:r>
       <w:r>
-        <w:t xml:space="preserve">Stratified rescaled bootstrap with BCa and bootstrap-</w:t>
+        <w:t xml:space="preserve">The recommended approach is a stratified rescaled bootstrap with BCa and bootstrap-</w:t>
       </w:r>
       <w:r>
         <w:rPr>
@@ -7981,7 +7981,7 @@
         <w:t xml:space="preserve">t</w:t>
       </w:r>
       <w:r>
-        <w:t xml:space="preserve">; flag strata with zero or one error and compare against empirical likelihood and a zero-inflated parametric bound.</w:t>
+        <w:t xml:space="preserve">, with strata that have zero or one error flagged and compared against empirical likelihood and a zero-inflated parametric bound.</w:t>
       </w:r>
     </w:p>
     <w:bookmarkEnd w:id="87"/>
@@ -8000,7 +8000,7 @@
         <w:pStyle w:val="FirstParagraph"/>
       </w:pPr>
       <w:r>
-        <w:t xml:space="preserve">The strongest design is a design-based Monte Carlo study: build realistic finite populations for each program, rerun the program’s actual sampling design and estimator thousands of times, and score every interval method against the known truth on the metric that matches how the interval is used. This is the approach Edwards et al. use for FFS audits, extended to bootstrap and audit-finding simulation comparators and to the five CMS designs.</w:t>
+        <w:t xml:space="preserve">The strongest design is a design-based Monte Carlo study. Such a study would build realistic finite populations for each program, rerun the program’s actual sampling design and estimator thousands of times, and score every interval method against the known truth on the metric that matches how the interval is used. This is the approach Edwards et al. use for FFS audits, extended to bootstrap and audit-finding simulation comparators and to the five CMS designs.</w:t>
       </w:r>
     </w:p>
     <w:bookmarkStart w:id="89" w:name="study-pipeline"/>
@@ -8031,7 +8031,7 @@
         <w:t xml:space="preserve"> </w:t>
       </w:r>
       <w:r>
-        <w:t xml:space="preserve">Fit unit-level error models to historical review outcomes: HCC-level validation probabilities and hierarchy moves for Part C and RADV; PDE-level documentation failure and pricing discrepancy for Part D; case-level eligibility error for PERM; application-level APTC error for EIPM. Impose them on real frame covariates (payments, risk scores, county rates) to form</w:t>
+        <w:t xml:space="preserve">Unit-level error models are fit to historical review outcomes: HCC-level validation probabilities and hierarchy moves for Part C and RADV; PDE-level documentation failure and pricing discrepancy for Part D; case-level eligibility error for PERM; application-level APTC error for EIPM. These models are imposed on real frame covariates (payments, risk scores, and county rates) to form</w:t>
       </w:r>
       <w:r>
         <w:t xml:space="preserve"> </w:t>
@@ -8049,7 +8049,7 @@
         <w:t xml:space="preserve"> </w:t>
       </w:r>
       <w:r>
-        <w:t xml:space="preserve">populations, then add stress populations on an error-rate grid from 0.01 to 0.95 with right-, left- and two-spike payment shapes.</w:t>
+        <w:t xml:space="preserve">populations, and stress populations are added on an error-rate grid from 0.01 to 0.95 with right-, left-, and two-spike payment shapes.</w:t>
       </w:r>
     </w:p>
     <w:p>
@@ -8071,7 +8071,7 @@
         <w:t xml:space="preserve"> </w:t>
       </w:r>
       <w:r>
-        <w:t xml:space="preserve">Reproduce frame rules (including the RADV prediction-model frame), strata, sample sizes and selection mechanics (sorted systematic selection for PERM; cohort versus random beneficiary for Part D).</w:t>
+        <w:t xml:space="preserve">Frame rules (including the RADV prediction-model frame), strata, sample sizes, and selection mechanics are reproduced (sorted systematic selection for PERM; cohort versus random beneficiary for Part D).</w:t>
       </w:r>
     </w:p>
     <w:p>
@@ -8087,13 +8087,13 @@
           <w:bCs/>
           <w:b/>
         </w:rPr>
-        <w:t xml:space="preserve">Apply the production estimator</w:t>
-      </w:r>
-      <w:r>
-        <w:t xml:space="preserve"> </w:t>
-      </w:r>
-      <w:r>
-        <w:t xml:space="preserve">and plausible alternatives (ratio vs expansion; enrollee-month weighting).</w:t>
+        <w:t xml:space="preserve">Apply the production estimator.</w:t>
+      </w:r>
+      <w:r>
+        <w:t xml:space="preserve"> </w:t>
+      </w:r>
+      <w:r>
+        <w:t xml:space="preserve">The production estimator is applied along with plausible alternatives (ratio vs expansion; enrollee-month weighting).</w:t>
       </w:r>
     </w:p>
     <w:p>
@@ -8109,13 +8109,13 @@
           <w:bCs/>
           <w:b/>
         </w:rPr>
-        <w:t xml:space="preserve">Compute every interval method</w:t>
-      </w:r>
-      <w:r>
-        <w:t xml:space="preserve"> </w:t>
-      </w:r>
-      <w:r>
-        <w:t xml:space="preserve">on each simulated sample (list below).</w:t>
+        <w:t xml:space="preserve">Compute every interval method.</w:t>
+      </w:r>
+      <w:r>
+        <w:t xml:space="preserve"> </w:t>
+      </w:r>
+      <w:r>
+        <w:t xml:space="preserve">Every interval method (listed below) is computed on each simulated sample.</w:t>
       </w:r>
     </w:p>
     <w:p>
@@ -8131,13 +8131,13 @@
           <w:bCs/>
           <w:b/>
         </w:rPr>
-        <w:t xml:space="preserve">Score</w:t>
-      </w:r>
-      <w:r>
-        <w:t xml:space="preserve"> </w:t>
-      </w:r>
-      <w:r>
-        <w:t xml:space="preserve">against the population truth and repeat 10,000 times per scenario cell.</w:t>
+        <w:t xml:space="preserve">Score.</w:t>
+      </w:r>
+      <w:r>
+        <w:t xml:space="preserve"> </w:t>
+      </w:r>
+      <w:r>
+        <w:t xml:space="preserve">Each interval is scored against the population truth, and the process is repeated 10,000 times per scenario cell.</w:t>
       </w:r>
     </w:p>
     <w:p>
@@ -8153,13 +8153,13 @@
           <w:bCs/>
           <w:b/>
         </w:rPr>
-        <w:t xml:space="preserve">Stress-test</w:t>
-      </w:r>
-      <w:r>
-        <w:t xml:space="preserve"> </w:t>
-      </w:r>
-      <w:r>
-        <w:t xml:space="preserve">with review measurement error (coder disagreement, overturns on appeal), missing records scored as errors, and frame misspecification.</w:t>
+        <w:t xml:space="preserve">Stress-test.</w:t>
+      </w:r>
+      <w:r>
+        <w:t xml:space="preserve"> </w:t>
+      </w:r>
+      <w:r>
+        <w:t xml:space="preserve">Results are stress-tested with review measurement error (for example, coder disagreement and overturns on appeal), missing records scored as errors, and frame misspecification.</w:t>
       </w:r>
     </w:p>
     <w:bookmarkEnd w:id="89"/>
@@ -8213,10 +8213,7 @@
         <w:t xml:space="preserve">t</w:t>
       </w:r>
       <w:r>
-        <w:t xml:space="preserve"> </w:t>
-      </w:r>
-      <w:r>
-        <w:t xml:space="preserve">and BCa intervals; calibrated (double) bootstrap; empirical likelihood; and, for RADV, a hypergeometric or minimum-sum bound as a conservative floor.</w:t>
+        <w:t xml:space="preserve">, and BCa intervals; calibrated (double) bootstrap; empirical likelihood; and, for RADV, a hypergeometric or minimum-sum bound as a conservative floor.</w:t>
       </w:r>
     </w:p>
     <w:bookmarkEnd w:id="90"/>
@@ -8440,16 +8437,10 @@
         <w:pStyle w:val="BodyText"/>
       </w:pPr>
       <w:r>
-        <w:t xml:space="preserve">Define</w:t>
-      </w:r>
-      <w:r>
-        <w:t xml:space="preserve"> </w:t>
-      </w:r>
-      <w:r>
         <w:t xml:space="preserve">“</w:t>
       </w:r>
       <w:r>
-        <w:t xml:space="preserve">viable</w:t>
+        <w:t xml:space="preserve">Viable</w:t>
       </w:r>
       <w:r>
         <w:t xml:space="preserve">”</w:t>
@@ -8458,7 +8449,7 @@
         <w:t xml:space="preserve"> </w:t>
       </w:r>
       <w:r>
-        <w:t xml:space="preserve">before running: for example, one-sided exceedance within nominal + 2 Monte Carlo standard errors in every scenario cell. With 10,000 replications the Monte Carlo standard error of a 10% exceedance rate is 0.3 percentage points. Among viable methods, rank by recovery or width.</w:t>
+        <w:t xml:space="preserve">should be defined before running the study (for example, one-sided exceedance within nominal + 2 Monte Carlo standard errors in every scenario cell). With 10,000 replications, the Monte Carlo standard error of a 10% exceedance rate is 0.3 percentage points. Viable methods can then be ranked by recovery or width.</w:t>
       </w:r>
     </w:p>
     <w:bookmarkEnd w:id="91"/>
@@ -8853,7 +8844,7 @@
         <w:pStyle w:val="FirstParagraph"/>
       </w:pPr>
       <w:r>
-        <w:t xml:space="preserve">A bootstrap inside a Monte Carlo study multiplies costs: 10,000 outer replications × 5,000 resamples is 5 × 10⁷ estimator evaluations per cell. Three things keep it tractable: precompute unit-level errors so each resample is a weighted sum; generate multinomial or rescaled weights in vectorized blocks; and run cells as independent batch jobs over Parquet-staged populations. The warp-speed method of Giacomini, Politis and White (2013) can screen percentile-type intervals with one resample per outer replication before full runs; it does not cover BCa.</w:t>
+        <w:t xml:space="preserve">A bootstrap inside a Monte Carlo study multiplies costs: 10,000 outer replications × 5,000 resamples is 5 × 10⁷ estimator evaluations per cell. Three practices keep this tractable: precomputing unit-level errors so that each resample is a weighted sum, generating multinomial or rescaled weights in vectorized blocks, and running cells as independent batch jobs over Parquet-staged populations. The warp-speed method of Giacomini, Politis and White (2013) can screen percentile-type intervals with one resample per outer replication before full runs, but it does not cover BCa.</w:t>
       </w:r>
     </w:p>
     <w:bookmarkEnd w:id="93"/>
@@ -8915,7 +8906,7 @@
         <w:t xml:space="preserve"> </w:t>
       </w:r>
       <w:r>
-        <w:t xml:space="preserve">at the unit level, held under appropriate data use terms. They would be used to calibrate error models.</w:t>
+        <w:t xml:space="preserve">at the unit level, held under appropriate data use terms. These outcomes would be used to calibrate error models.</w:t>
       </w:r>
     </w:p>
     <w:p>
@@ -8945,7 +8936,7 @@
         <w:pStyle w:val="FirstParagraph"/>
       </w:pPr>
       <w:r>
-        <w:t xml:space="preserve">Without these, a study can still proceed on synthetic populations calibrated to public aggregates, with illustrative strata where the real ones are not published. That is the approach of the companion Monte Carlo evaluation, which applies this agenda to all five programs.</w:t>
+        <w:t xml:space="preserve">Without these, a study can still proceed on synthetic populations calibrated to public aggregates, with illustrative strata where the actual strata are not published. This is the approach of the companion Monte Carlo evaluation, which applies this agenda to all five programs.</w:t>
       </w:r>
     </w:p>
     <w:bookmarkEnd w:id="94"/>
@@ -9016,7 +9007,7 @@
         <w:pStyle w:val="FirstParagraph"/>
       </w:pPr>
       <w:r>
-        <w:t xml:space="preserve">The evidence that exists points in a consistent direction. Interval accuracy depends on the skew of the errors and the number of nonzero errors in the sample. Normal-theory intervals are conservative when errors are rare and liberal when they are frequent. Second-order bootstrap intervals correct much of the rare-error failure, but have barely been tested where errors are frequent and all-or-nothing.</w:t>
+        <w:t xml:space="preserve">The existing evidence points in a consistent direction. Interval accuracy depends on the skew of the errors and the number of nonzero errors in the sample. Normal-theory intervals are conservative when errors are rare and liberal when they are frequent. Second-order bootstrap intervals correct much of the rare-error failure but have barely been tested where errors are frequent and all-or-nothing.</w:t>
       </w:r>
     </w:p>
     <w:p>
@@ -9024,7 +9015,7 @@
         <w:pStyle w:val="BodyText"/>
       </w:pPr>
       <w:r>
-        <w:t xml:space="preserve">Audit-finding simulation is attractive for nonlinear payment rules, yet its intervals have never been validated. Because it does not resample the audit, it carries a specific risk: understating uncertainty.</w:t>
+        <w:t xml:space="preserve">Audit-finding simulation is attractive for nonlinear payment rules. However, its intervals have never been validated. Because it does not resample the audit, it carries a specific risk of understating uncertainty.</w:t>
       </w:r>
     </w:p>
     <w:p>
@@ -9032,7 +9023,7 @@
         <w:pStyle w:val="BodyText"/>
       </w:pPr>
       <w:r>
-        <w:t xml:space="preserve">The comparative accuracy of these methods should therefore be established empirically before any of them is relied on for new uses. The design is a Monte Carlo evaluation against populations with known truth, run under each program’s actual design and scored on the metric that matches how the estimate is used. The new uses include smaller audits, state-level PERM disallowances, State-based Exchange measurement and contract-level recovery.</w:t>
+        <w:t xml:space="preserve">The comparative accuracy of these methods should therefore be established empirically before any of them is relied on for new uses. The appropriate design is a Monte Carlo evaluation against populations with known truth, run under each program’s actual design and scored on the metric that matches how the estimate is used. These new uses include smaller audits, state-level PERM disallowances, State-based Exchange measurement, and contract-level recovery.</w:t>
       </w:r>
     </w:p>
     <w:bookmarkEnd w:id="96"/>

</xml_diff>